<commit_message>
UNIT TEST DE HOTELES COMPLETO, 2 FE Y BE EN AEROLINEAS  Y 2 DE FE BE EN AGENCIA DE VIAJES
</commit_message>
<xml_diff>
--- a/Manual_Programador_Hotelera.docx
+++ b/Manual_Programador_Hotelera.docx
@@ -167,6 +167,30 @@
           <w:rFonts w:ascii="Calibri" w:hAnsi="Calibri"/>
           <w:sz w:val="22"/>
         </w:rPr>
+        <w:t>Parte 5 — Queries SQL del Backend</w:t>
+      </w:r>
+    </w:p>
+    <w:p>
+      <w:pPr>
+        <w:pStyle w:val="ListBullet"/>
+      </w:pPr>
+      <w:r>
+        <w:rPr>
+          <w:rFonts w:ascii="Calibri" w:hAnsi="Calibri"/>
+          <w:sz w:val="22"/>
+        </w:rPr>
+        <w:t>Anexo  — Queries SQL de Métricas para Defensa</w:t>
+      </w:r>
+    </w:p>
+    <w:p>
+      <w:pPr>
+        <w:pStyle w:val="ListBullet"/>
+      </w:pPr>
+      <w:r>
+        <w:rPr>
+          <w:rFonts w:ascii="Calibri" w:hAnsi="Calibri"/>
+          <w:sz w:val="22"/>
+        </w:rPr>
         <w:t>Inventario de Cobertura</w:t>
       </w:r>
     </w:p>
@@ -10339,6 +10363,1793 @@
           <w:sz w:val="22"/>
         </w:rPr>
         <w:t>Si POST de cancelación a Agencia falla: la cancelación local en Miku Inn ya se realizó. AgenciaNotificadorExternoService captura la excepción y la registra en consola (System.out.println). No hay reintentos automáticos. Si X-Agencia-Token es inválido: HTTP 401. Si la reservación tiene traslape de fechas: HTTP 409. Si habitación no existe: HTTP 404.</w:t>
+      </w:r>
+    </w:p>
+    <w:p>
+      <w:r>
+        <w:br w:type="page"/>
+      </w:r>
+    </w:p>
+    <w:p>
+      <w:pPr>
+        <w:spacing w:before="280" w:after="120"/>
+      </w:pPr>
+      <w:r>
+        <w:rPr>
+          <w:rFonts w:ascii="Calibri" w:hAnsi="Calibri"/>
+          <w:b/>
+          <w:color w:val="1F3864"/>
+          <w:sz w:val="32"/>
+        </w:rPr>
+        <w:t>Parte 5 — Queries SQL del Backend</w:t>
+      </w:r>
+    </w:p>
+    <w:p>
+      <w:r>
+        <w:rPr>
+          <w:rFonts w:ascii="Calibri" w:hAnsi="Calibri"/>
+          <w:sz w:val="22"/>
+        </w:rPr>
+        <w:t>Base de datos: Oracle Database. Driver: ojdbc11 23.3.0.23.09. Parámetros con ? (JDBC). Fechas con SYSDATE. Los queries usan LOWER(TRIM()) para comparaciones robustas de estados.</w:t>
+      </w:r>
+    </w:p>
+    <w:p>
+      <w:pPr>
+        <w:spacing w:before="200" w:after="80"/>
+      </w:pPr>
+      <w:r>
+        <w:rPr>
+          <w:rFonts w:ascii="Calibri" w:hAnsi="Calibri"/>
+          <w:b/>
+          <w:color w:val="2E75B6"/>
+          <w:sz w:val="26"/>
+        </w:rPr>
+        <w:t>5.1 Autenticación</w:t>
+      </w:r>
+    </w:p>
+    <w:p>
+      <w:pPr>
+        <w:shd w:val="clear" w:color="auto" w:fill="F2F2F2"/>
+        <w:spacing w:before="60" w:after="60"/>
+        <w:ind w:left="288" w:right="288"/>
+      </w:pPr>
+      <w:r>
+        <w:rPr>
+          <w:rFonts w:ascii="Consolas" w:hAnsi="Consolas"/>
+          <w:sz w:val="18"/>
+        </w:rPr>
+        <w:t>-- AuthRepository.java</w:t>
+        <w:br/>
+        <w:t>-- Endpoint: POST /auth/login → AuthController → AuthService</w:t>
+        <w:br/>
+        <w:br/>
+        <w:t>SELECT u.ID, u.Correo, u.Contrasena, u.Pasaporte, u.Username,</w:t>
+        <w:br/>
+        <w:t xml:space="preserve">       u.Nombre, u.Apellido, u.Rol_ID, u.Telefono,</w:t>
+        <w:br/>
+        <w:t xml:space="preserve">       u.Fecha_Nacimiento, u.Ciudad_ID</w:t>
+        <w:br/>
+        <w:t>FROM Usuario u</w:t>
+        <w:br/>
+        <w:t>WHERE u.Username = ? OR u.Correo = ? OR u.Pasaporte = ?</w:t>
+      </w:r>
+    </w:p>
+    <w:p>
+      <w:pPr>
+        <w:spacing w:before="200" w:after="80"/>
+      </w:pPr>
+      <w:r>
+        <w:rPr>
+          <w:rFonts w:ascii="Calibri" w:hAnsi="Calibri"/>
+          <w:b/>
+          <w:color w:val="2E75B6"/>
+          <w:sz w:val="26"/>
+        </w:rPr>
+        <w:t>5.2 Registro de Usuario</w:t>
+      </w:r>
+    </w:p>
+    <w:p>
+      <w:pPr>
+        <w:shd w:val="clear" w:color="auto" w:fill="F2F2F2"/>
+        <w:spacing w:before="60" w:after="60"/>
+        <w:ind w:left="288" w:right="288"/>
+      </w:pPr>
+      <w:r>
+        <w:rPr>
+          <w:rFonts w:ascii="Consolas" w:hAnsi="Consolas"/>
+          <w:sz w:val="18"/>
+        </w:rPr>
+        <w:t>-- UsuarioRepository.java</w:t>
+        <w:br/>
+        <w:t>-- Endpoint: POST /usuarios/registrar</w:t>
+        <w:br/>
+        <w:br/>
+        <w:t>-- Verificar duplicados</w:t>
+        <w:br/>
+        <w:t>SELECT COUNT(*) FROM Usuario WHERE Username  = ?</w:t>
+        <w:br/>
+        <w:t>SELECT COUNT(*) FROM Usuario WHERE Correo    = ?</w:t>
+        <w:br/>
+        <w:t>SELECT COUNT(*) FROM Usuario WHERE Pasaporte = ?</w:t>
+        <w:br/>
+        <w:br/>
+        <w:t>-- Crear usuario (rol 1 = Cliente por defecto)</w:t>
+        <w:br/>
+        <w:t>INSERT INTO Usuario (Correo, Contrasena, Pasaporte, Username, Nombre,</w:t>
+        <w:br/>
+        <w:t xml:space="preserve">                     Apellido, Rol_ID, Telefono, Fecha_Nacimiento, Ciudad_ID)</w:t>
+        <w:br/>
+        <w:t>VALUES (?, ?, ?, ?, ?, ?, 1, ?, ?, ?)</w:t>
+      </w:r>
+    </w:p>
+    <w:p>
+      <w:pPr>
+        <w:spacing w:before="200" w:after="80"/>
+      </w:pPr>
+      <w:r>
+        <w:rPr>
+          <w:rFonts w:ascii="Calibri" w:hAnsi="Calibri"/>
+          <w:b/>
+          <w:color w:val="2E75B6"/>
+          <w:sz w:val="26"/>
+        </w:rPr>
+        <w:t>5.3 Perfil de Usuario</w:t>
+      </w:r>
+    </w:p>
+    <w:p>
+      <w:pPr>
+        <w:shd w:val="clear" w:color="auto" w:fill="F2F2F2"/>
+        <w:spacing w:before="60" w:after="60"/>
+        <w:ind w:left="288" w:right="288"/>
+      </w:pPr>
+      <w:r>
+        <w:rPr>
+          <w:rFonts w:ascii="Consolas" w:hAnsi="Consolas"/>
+          <w:sz w:val="18"/>
+        </w:rPr>
+        <w:t>-- UsuarioRepository.java</w:t>
+        <w:br/>
+        <w:t>-- Endpoint: POST /perfil → UsuarioController → UsuarioService</w:t>
+        <w:br/>
+        <w:br/>
+        <w:t>SELECT u.ID, u.Username, u.Correo, u.Pasaporte, u.Nombre, u.Apellido,</w:t>
+        <w:br/>
+        <w:t xml:space="preserve">       u.Telefono, u.Fecha_Nacimiento, u.Rol_ID,</w:t>
+        <w:br/>
+        <w:t xml:space="preserve">       c.Nombre AS Ciudad, p.Nombre AS Pais</w:t>
+        <w:br/>
+        <w:t>FROM Usuario u</w:t>
+        <w:br/>
+        <w:t>LEFT JOIN Ciudad c ON u.Ciudad_ID = c.ID</w:t>
+        <w:br/>
+        <w:t>LEFT JOIN Pais   p ON c.Pais_ID   = p.ID</w:t>
+        <w:br/>
+        <w:t>WHERE u.ID = ?</w:t>
+        <w:br/>
+        <w:br/>
+        <w:t>-- Nacionalidades del usuario</w:t>
+        <w:br/>
+        <w:t>SELECT n.Nombre FROM UsuarioNacionalidad un</w:t>
+        <w:br/>
+        <w:t>JOIN Nacionalidad n ON un.Nacionalidad_ID = n.ID</w:t>
+        <w:br/>
+        <w:t>WHERE un.Usuario_ID = ?</w:t>
+        <w:br/>
+        <w:br/>
+        <w:t>-- Actualizar teléfono</w:t>
+        <w:br/>
+        <w:t>UPDATE Usuario SET Telefono = ? WHERE ID = ?</w:t>
+        <w:br/>
+        <w:br/>
+        <w:t>-- Obtener contraseña para verificar (cambio de contraseña)</w:t>
+        <w:br/>
+        <w:t>SELECT Contrasena FROM Usuario WHERE ID = ?</w:t>
+        <w:br/>
+        <w:br/>
+        <w:t>-- Actualizar contraseña (nuevo hash BCrypt)</w:t>
+        <w:br/>
+        <w:t>UPDATE Usuario SET Contrasena = ? WHERE ID = ?</w:t>
+      </w:r>
+    </w:p>
+    <w:p>
+      <w:pPr>
+        <w:spacing w:before="200" w:after="80"/>
+      </w:pPr>
+      <w:r>
+        <w:rPr>
+          <w:rFonts w:ascii="Calibri" w:hAnsi="Calibri"/>
+          <w:b/>
+          <w:color w:val="2E75B6"/>
+          <w:sz w:val="26"/>
+        </w:rPr>
+        <w:t>5.4 Búsqueda de Hoteles</w:t>
+      </w:r>
+    </w:p>
+    <w:p>
+      <w:pPr>
+        <w:shd w:val="clear" w:color="auto" w:fill="F2F2F2"/>
+        <w:spacing w:before="60" w:after="60"/>
+        <w:ind w:left="288" w:right="288"/>
+      </w:pPr>
+      <w:r>
+        <w:rPr>
+          <w:rFonts w:ascii="Consolas" w:hAnsi="Consolas"/>
+          <w:sz w:val="18"/>
+        </w:rPr>
+        <w:t>-- BusquedaRepository.java</w:t>
+        <w:br/>
+        <w:t>-- Endpoint: POST /busqueda</w:t>
+        <w:br/>
+        <w:br/>
+        <w:t>-- Buscar ciudad por nombre</w:t>
+        <w:br/>
+        <w:t>SELECT c.ID FROM Ciudad c JOIN Pais p ON c.Pais_ID = p.ID</w:t>
+        <w:br/>
+        <w:t>WHERE LOWER(TRIM(c.Nombre)) = LOWER(TRIM(?))</w:t>
+        <w:br/>
+        <w:t xml:space="preserve">  AND LOWER(TRIM(p.Nombre)) = LOWER(TRIM(?))</w:t>
+        <w:br/>
+        <w:br/>
+        <w:t>-- Registrar búsqueda</w:t>
+        <w:br/>
+        <w:t>INSERT INTO Busqueda (CiudadID, FechaCheckIn, FechaCheckOut, CantidadPersonas,</w:t>
+        <w:br/>
+        <w:t xml:space="preserve">                      UsuarioID, AgenciaID, TipoBusquedaID, Fecha)</w:t>
+        <w:br/>
+        <w:t>VALUES (?, ?, ?, ?, ?, NULL, ?, SYSDATE)</w:t>
+        <w:br/>
+        <w:br/>
+        <w:t>-- Hoteles activos en ciudad</w:t>
+        <w:br/>
+        <w:t>SELECT h.ID, h.Nombre, h.Direccion, h.Descripcion, h.Rating, e.Estado,</w:t>
+        <w:br/>
+        <w:t xml:space="preserve">       c.Nombre AS Ciudad, p.Nombre AS Pais</w:t>
+        <w:br/>
+        <w:t>FROM Hotel h</w:t>
+        <w:br/>
+        <w:t>JOIN Estado e ON h.EstadoID = e.ID</w:t>
+        <w:br/>
+        <w:t>JOIN Ciudad c ON h.CiudadID = c.ID</w:t>
+        <w:br/>
+        <w:t>JOIN Pais   p ON c.Pais_ID  = p.ID</w:t>
+        <w:br/>
+        <w:t>WHERE h.CiudadID = ? AND LOWER(TRIM(e.Estado)) = 'activo'</w:t>
+        <w:br/>
+        <w:br/>
+        <w:t>-- Amenidades del hotel</w:t>
+        <w:br/>
+        <w:t>SELECT ha.ID AS HotelAmenidadId, ha.AmenidadID, ha.Descripcion,</w:t>
+        <w:br/>
+        <w:t xml:space="preserve">       a.nombre AS NombreAmenidad</w:t>
+        <w:br/>
+        <w:t>FROM HotelAmenidad ha JOIN Amenidad a ON ha.AmenidadID = a.ID</w:t>
+        <w:br/>
+        <w:t>WHERE ha.HotelID = ?</w:t>
+        <w:br/>
+        <w:br/>
+        <w:t>-- Tipos de habitación disponibles (sin traslape de fechas)</w:t>
+        <w:br/>
+        <w:t>SELECT t.ID AS TipoID, t.NOMBRE AS TipoHabitacion, t.PRECIOPERSONA,</w:t>
+        <w:br/>
+        <w:t xml:space="preserve">       t.PRECIONOCHE, t.CAPACIDADMAXIMA, t.METROSCUADRADOS,</w:t>
+        <w:br/>
+        <w:t xml:space="preserve">       c.TIPO_DE_CLASE AS TipoCama</w:t>
+        <w:br/>
+        <w:t>FROM TipoHabitacion t JOIN Cama c ON t.TIPOCAMAID = c.ID</w:t>
+        <w:br/>
+        <w:t>WHERE t.CAPACIDADMAXIMA &gt;= ?</w:t>
+        <w:br/>
+        <w:t xml:space="preserve">  AND EXISTS (</w:t>
+        <w:br/>
+        <w:t xml:space="preserve">    SELECT 1 FROM Habitacion h</w:t>
+        <w:br/>
+        <w:t xml:space="preserve">    JOIN EstadoHabitacion e ON h.ESTADO_ID = e.ID</w:t>
+        <w:br/>
+        <w:t xml:space="preserve">    WHERE h.TIPOHABITACIONID = t.ID AND h.HOTELID = ?</w:t>
+        <w:br/>
+        <w:t xml:space="preserve">      AND LOWER(TRIM(e.TIPO_DE_CLASE)) = 'activa'</w:t>
+        <w:br/>
+        <w:t xml:space="preserve">      AND h.ID NOT IN (</w:t>
+        <w:br/>
+        <w:t xml:space="preserve">        SELECT dr.HabitacionID FROM DetallesReservacion dr</w:t>
+        <w:br/>
+        <w:t xml:space="preserve">        JOIN Reservacion  r  ON dr.ReservacionID = r.ID</w:t>
+        <w:br/>
+        <w:t xml:space="preserve">        JOIN EstadoReserva er ON r.EstadoID      = er.ID</w:t>
+        <w:br/>
+        <w:t xml:space="preserve">        WHERE LOWER(TRIM(er.Estado)) IN ('pendiente', 'confirmada')</w:t>
+        <w:br/>
+        <w:t xml:space="preserve">          AND dr.FechaCheckIn  &lt; ?</w:t>
+        <w:br/>
+        <w:t xml:space="preserve">          AND dr.FechaCheckOut &gt; ?</w:t>
+        <w:br/>
+        <w:t xml:space="preserve">      )</w:t>
+        <w:br/>
+        <w:t xml:space="preserve">  )</w:t>
+        <w:br/>
+        <w:br/>
+        <w:t>-- Habitaciones disponibles de un tipo (para asignación)</w:t>
+        <w:br/>
+        <w:t>SELECT h.ID, h.NUMEROHABITACION FROM Habitacion h</w:t>
+        <w:br/>
+        <w:t>JOIN EstadoHabitacion e ON h.ESTADO_ID = e.ID</w:t>
+        <w:br/>
+        <w:t>WHERE h.HOTELID = ? AND h.TIPOHABITACIONID = ?</w:t>
+        <w:br/>
+        <w:t xml:space="preserve">  AND LOWER(TRIM(e.TIPO_DE_CLASE)) = 'activa'</w:t>
+        <w:br/>
+        <w:t xml:space="preserve">  AND h.ID NOT IN (</w:t>
+        <w:br/>
+        <w:t xml:space="preserve">    SELECT dr.HabitacionID FROM DetallesReservacion dr</w:t>
+        <w:br/>
+        <w:t xml:space="preserve">    JOIN Reservacion  r  ON dr.ReservacionID = r.ID</w:t>
+        <w:br/>
+        <w:t xml:space="preserve">    JOIN EstadoReserva er ON r.EstadoID      = er.ID</w:t>
+        <w:br/>
+        <w:t xml:space="preserve">    WHERE LOWER(TRIM(er.Estado)) IN ('pendiente', 'confirmada')</w:t>
+        <w:br/>
+        <w:t xml:space="preserve">      AND dr.FechaCheckIn &lt; ? AND dr.FechaCheckOut &gt; ?</w:t>
+        <w:br/>
+        <w:t xml:space="preserve">  )</w:t>
+      </w:r>
+    </w:p>
+    <w:p>
+      <w:pPr>
+        <w:spacing w:before="200" w:after="80"/>
+      </w:pPr>
+      <w:r>
+        <w:rPr>
+          <w:rFonts w:ascii="Calibri" w:hAnsi="Calibri"/>
+          <w:b/>
+          <w:color w:val="2E75B6"/>
+          <w:sz w:val="26"/>
+        </w:rPr>
+        <w:t>5.5 Reservación</w:t>
+      </w:r>
+    </w:p>
+    <w:p>
+      <w:pPr>
+        <w:shd w:val="clear" w:color="auto" w:fill="F2F2F2"/>
+        <w:spacing w:before="60" w:after="60"/>
+        <w:ind w:left="288" w:right="288"/>
+      </w:pPr>
+      <w:r>
+        <w:rPr>
+          <w:rFonts w:ascii="Consolas" w:hAnsi="Consolas"/>
+          <w:sz w:val="18"/>
+        </w:rPr>
+        <w:t>-- ReservacionRepository.java</w:t>
+        <w:br/>
+        <w:t>-- Endpoint: POST /reservaciones</w:t>
+        <w:br/>
+        <w:br/>
+        <w:t>-- Obtener precios de habitación</w:t>
+        <w:br/>
+        <w:t>SELECT t.PRECIONOCHE, t.PRECIOPERSONA, t.CAPACIDADMAXIMA</w:t>
+        <w:br/>
+        <w:t>FROM Habitacion h JOIN TipoHabitacion t ON h.TIPOHABITACIONID = t.ID</w:t>
+        <w:br/>
+        <w:t>WHERE h.ID = ?</w:t>
+        <w:br/>
+        <w:br/>
+        <w:t>-- Verificar traslape de fechas</w:t>
+        <w:br/>
+        <w:t>SELECT COUNT(*) AS total FROM DetallesReservacion dr</w:t>
+        <w:br/>
+        <w:t>JOIN Reservacion  r  ON dr.ReservacionID = r.ID</w:t>
+        <w:br/>
+        <w:t>JOIN EstadoReserva er ON r.EstadoID      = er.ID</w:t>
+        <w:br/>
+        <w:t>WHERE dr.HabitacionID = ?</w:t>
+        <w:br/>
+        <w:t xml:space="preserve">  AND LOWER(TRIM(er.Estado)) IN ('pendiente', 'confirmada')</w:t>
+        <w:br/>
+        <w:t xml:space="preserve">  AND dr.FechaCheckIn  &lt; ?</w:t>
+        <w:br/>
+        <w:t xml:space="preserve">  AND dr.FechaCheckOut &gt; ?</w:t>
+        <w:br/>
+        <w:br/>
+        <w:t>-- Expirar reservaciones pendientes del usuario</w:t>
+        <w:br/>
+        <w:t>UPDATE Reservacion</w:t>
+        <w:br/>
+        <w:t>SET EstadoID         = (SELECT ID FROM EstadoReserva WHERE LOWER(Estado)='expirada'),</w:t>
+        <w:br/>
+        <w:t xml:space="preserve">    Fecha_Expiracion = SYSDATE</w:t>
+        <w:br/>
+        <w:t>WHERE Usuario_ID = ? AND ID != ?</w:t>
+        <w:br/>
+        <w:t xml:space="preserve">  AND EstadoID = (SELECT ID FROM EstadoReserva WHERE LOWER(Estado)='pendiente')</w:t>
+        <w:br/>
+        <w:br/>
+        <w:t>-- Crear reservación</w:t>
+        <w:br/>
+        <w:t>INSERT INTO Reservacion (No_Reservacion, Total, EstadoID, Usuario_ID,</w:t>
+        <w:br/>
+        <w:t xml:space="preserve">                         Fecha_Creacion, Fecha_Expiracion)</w:t>
+        <w:br/>
+        <w:t>VALUES (?, ?, 1, ?, ?, ?)</w:t>
+        <w:br/>
+        <w:br/>
+        <w:t>-- Crear detalle de habitación</w:t>
+        <w:br/>
+        <w:t>INSERT INTO DetallesReservacion (ReservacionID, HabitacionID, FechaCheckIn,</w:t>
+        <w:br/>
+        <w:t xml:space="preserve">                                  FechaCheckOut, CantidadPersonas, Total)</w:t>
+        <w:br/>
+        <w:t>VALUES (?, ?, ?, ?, ?, ?)</w:t>
+        <w:br/>
+        <w:br/>
+        <w:t>-- Listar reservaciones del usuario con JOIN completo</w:t>
+        <w:br/>
+        <w:t>SELECT r.ID, r.No_Reservacion, r.Total, r.Fecha_Creacion, r.Fecha_Expiracion,</w:t>
+        <w:br/>
+        <w:t xml:space="preserve">       r.Fecha_Cancelacion, r.Motivo_Cancelacion, er.Estado,</w:t>
+        <w:br/>
+        <w:t xml:space="preserve">       dr.ID AS DetalleID, dr.HabitacionID, dr.FechaCheckIn, dr.FechaCheckOut,</w:t>
+        <w:br/>
+        <w:t xml:space="preserve">       dr.CantidadPersonas, dr.Total AS TotalDetalle,</w:t>
+        <w:br/>
+        <w:t xml:space="preserve">       h.Descripcion AS DescripcionHabitacion, h.NUMEROHABITACION,</w:t>
+        <w:br/>
+        <w:t xml:space="preserve">       t.NOMBRE AS TipoHabitacion, c.TIPO_DE_CLASE AS TipoCama,</w:t>
+        <w:br/>
+        <w:t xml:space="preserve">       hot.ID AS HotelID, hot.Nombre AS NombreHotel</w:t>
+        <w:br/>
+        <w:t>FROM Reservacion r</w:t>
+        <w:br/>
+        <w:t>JOIN EstadoReserva er ON r.EstadoID     = er.ID</w:t>
+        <w:br/>
+        <w:t>JOIN DetallesReservacion dr ON dr.ReservacionID = r.ID</w:t>
+        <w:br/>
+        <w:t>JOIN Habitacion    h  ON dr.HabitacionID = h.ID</w:t>
+        <w:br/>
+        <w:t>JOIN TipoHabitacion t ON h.TIPOHABITACIONID = t.ID</w:t>
+        <w:br/>
+        <w:t>JOIN Cama          c  ON t.TIPOCAMAID   = c.ID</w:t>
+        <w:br/>
+        <w:t>JOIN Hotel        hot ON h.HOTELID      = hot.ID</w:t>
+        <w:br/>
+        <w:t>WHERE r.Usuario_ID = ?</w:t>
+        <w:br/>
+        <w:t>ORDER BY r.Fecha_Creacion DESC, r.ID, dr.ID</w:t>
+        <w:br/>
+        <w:br/>
+        <w:t>-- Expirar reservaciones vencidas (ExpiracionService)</w:t>
+        <w:br/>
+        <w:t>UPDATE Reservacion</w:t>
+        <w:br/>
+        <w:t>SET EstadoID = (SELECT ID FROM EstadoReserva WHERE LOWER(Estado)='expirada')</w:t>
+        <w:br/>
+        <w:t>WHERE EstadoID = (SELECT ID FROM EstadoReserva WHERE LOWER(Estado)='pendiente')</w:t>
+        <w:br/>
+        <w:t xml:space="preserve">  AND Fecha_Expiracion &lt; SYSDATE</w:t>
+      </w:r>
+    </w:p>
+    <w:p>
+      <w:pPr>
+        <w:spacing w:before="200" w:after="80"/>
+      </w:pPr>
+      <w:r>
+        <w:rPr>
+          <w:rFonts w:ascii="Calibri" w:hAnsi="Calibri"/>
+          <w:b/>
+          <w:color w:val="2E75B6"/>
+          <w:sz w:val="26"/>
+        </w:rPr>
+        <w:t>5.6 Pago</w:t>
+      </w:r>
+    </w:p>
+    <w:p>
+      <w:pPr>
+        <w:shd w:val="clear" w:color="auto" w:fill="F2F2F2"/>
+        <w:spacing w:before="60" w:after="60"/>
+        <w:ind w:left="288" w:right="288"/>
+      </w:pPr>
+      <w:r>
+        <w:rPr>
+          <w:rFonts w:ascii="Consolas" w:hAnsi="Consolas"/>
+          <w:sz w:val="18"/>
+        </w:rPr>
+        <w:t>-- PagoRepository.java / PagoAgenciaRepository.java</w:t>
+        <w:br/>
+        <w:t>-- Endpoint: POST /reservaciones/{id}/pago</w:t>
+        <w:br/>
+        <w:br/>
+        <w:t>-- Confirmar pago → estado CONFIRMADA</w:t>
+        <w:br/>
+        <w:t>UPDATE Reservacion</w:t>
+        <w:br/>
+        <w:t>SET EstadoID = (SELECT ID FROM EstadoReserva WHERE LOWER(TRIM(Estado))='confirmada')</w:t>
+        <w:br/>
+        <w:t>WHERE ID = ?</w:t>
+      </w:r>
+    </w:p>
+    <w:p>
+      <w:pPr>
+        <w:spacing w:before="200" w:after="80"/>
+      </w:pPr>
+      <w:r>
+        <w:rPr>
+          <w:rFonts w:ascii="Calibri" w:hAnsi="Calibri"/>
+          <w:b/>
+          <w:color w:val="2E75B6"/>
+          <w:sz w:val="26"/>
+        </w:rPr>
+        <w:t>5.7 Cancelación</w:t>
+      </w:r>
+    </w:p>
+    <w:p>
+      <w:pPr>
+        <w:shd w:val="clear" w:color="auto" w:fill="F2F2F2"/>
+        <w:spacing w:before="60" w:after="60"/>
+        <w:ind w:left="288" w:right="288"/>
+      </w:pPr>
+      <w:r>
+        <w:rPr>
+          <w:rFonts w:ascii="Consolas" w:hAnsi="Consolas"/>
+          <w:sz w:val="18"/>
+        </w:rPr>
+        <w:t>-- CancelacionRepository.java</w:t>
+        <w:br/>
+        <w:t>-- Endpoint: POST /cancelaciones</w:t>
+        <w:br/>
+        <w:br/>
+        <w:t>-- Marcar como cancelada</w:t>
+        <w:br/>
+        <w:t>UPDATE Reservacion</w:t>
+        <w:br/>
+        <w:t>SET EstadoID          = (SELECT ID FROM EstadoReserva WHERE LOWER(Estado)='cancelada'),</w:t>
+        <w:br/>
+        <w:t xml:space="preserve">    Fecha_Cancelacion = SYSDATE,</w:t>
+        <w:br/>
+        <w:t xml:space="preserve">    Motivo_Cancelacion = ?</w:t>
+        <w:br/>
+        <w:t>WHERE ID = ? AND Usuario_ID = ?</w:t>
+      </w:r>
+    </w:p>
+    <w:p>
+      <w:pPr>
+        <w:spacing w:before="200" w:after="80"/>
+      </w:pPr>
+      <w:r>
+        <w:rPr>
+          <w:rFonts w:ascii="Calibri" w:hAnsi="Calibri"/>
+          <w:b/>
+          <w:color w:val="2E75B6"/>
+          <w:sz w:val="26"/>
+        </w:rPr>
+        <w:t>5.8 Gestión de Hoteles (Admin)</w:t>
+      </w:r>
+    </w:p>
+    <w:p>
+      <w:pPr>
+        <w:shd w:val="clear" w:color="auto" w:fill="F2F2F2"/>
+        <w:spacing w:before="60" w:after="60"/>
+        <w:ind w:left="288" w:right="288"/>
+      </w:pPr>
+      <w:r>
+        <w:rPr>
+          <w:rFonts w:ascii="Consolas" w:hAnsi="Consolas"/>
+          <w:sz w:val="18"/>
+        </w:rPr>
+        <w:t>-- HotelRepository.java</w:t>
+        <w:br/>
+        <w:br/>
+        <w:t>-- Listar amenidades disponibles</w:t>
+        <w:br/>
+        <w:t>SELECT ID, Nombre FROM Amenidad ORDER BY ID</w:t>
+        <w:br/>
+        <w:br/>
+        <w:t>-- Listar todos los hoteles con JOIN</w:t>
+        <w:br/>
+        <w:t>SELECT h.ID, h.Nombre, h.Direccion, h.Descripcion, h.Rating, h.EstadoID, e.Estado,</w:t>
+        <w:br/>
+        <w:t xml:space="preserve">       c.Nombre AS Ciudad, p.Nombre AS Pais</w:t>
+        <w:br/>
+        <w:t>FROM Hotel h</w:t>
+        <w:br/>
+        <w:t>JOIN Estado e ON h.EstadoID = e.ID</w:t>
+        <w:br/>
+        <w:t>JOIN Ciudad c ON h.CiudadID = c.ID</w:t>
+        <w:br/>
+        <w:t>JOIN Pais   p ON c.Pais_ID  = p.ID</w:t>
+        <w:br/>
+        <w:t>ORDER BY h.ID</w:t>
+        <w:br/>
+        <w:br/>
+        <w:t>-- Crear hotel</w:t>
+        <w:br/>
+        <w:t>INSERT INTO Hotel (Nombre, Direccion, Descripcion, Rating, EstadoID, CiudadID)</w:t>
+        <w:br/>
+        <w:t>VALUES (?, ?, ?, ?, ?, ?)</w:t>
+        <w:br/>
+        <w:br/>
+        <w:t>-- Actualizar hotel</w:t>
+        <w:br/>
+        <w:t>UPDATE Hotel SET Nombre=?, Direccion=?, Descripcion=?, Rating=?, EstadoID=?</w:t>
+        <w:br/>
+        <w:t>WHERE ID=?</w:t>
+        <w:br/>
+        <w:br/>
+        <w:t>-- Eliminar hotel (cascadas manuales)</w:t>
+        <w:br/>
+        <w:t>DELETE FROM ImagenHabitacion WHERE HabitacionID IN</w:t>
+        <w:br/>
+        <w:t xml:space="preserve">    (SELECT ID FROM Habitacion WHERE HotelID=?)</w:t>
+        <w:br/>
+        <w:t>DELETE FROM Habitacion WHERE HotelID=?</w:t>
+        <w:br/>
+        <w:t>DELETE FROM ImagenHotelAmenidad WHERE HotelAmenidadID IN</w:t>
+        <w:br/>
+        <w:t xml:space="preserve">    (SELECT ID FROM HotelAmenidad WHERE HotelID=?)</w:t>
+        <w:br/>
+        <w:t>DELETE FROM HotelAmenidad WHERE HotelID=?</w:t>
+        <w:br/>
+        <w:t>DELETE FROM ImagenHotel WHERE HotelID=?</w:t>
+        <w:br/>
+        <w:t>DELETE FROM Hotel WHERE ID=?</w:t>
+        <w:br/>
+        <w:br/>
+        <w:t>-- Listar habitaciones del hotel</w:t>
+        <w:br/>
+        <w:t>SELECT h.ID, h.HotelID, h.TIPOHABITACIONID, t.NOMBRE AS TipoHabitacion,</w:t>
+        <w:br/>
+        <w:t xml:space="preserve">       h.NUMEROHABITACION, t.TIPOCAMAID AS CamaID,</w:t>
+        <w:br/>
+        <w:t xml:space="preserve">       c.TIPO_DE_CLASE AS TipoCama, t.PRECIOPERSONA AS Precio_por_Persona,</w:t>
+        <w:br/>
+        <w:t xml:space="preserve">       t.PRECIONOCHE AS Precio_por_Noche, t.CAPACIDADMAXIMA, t.METROSCUADRADOS,</w:t>
+        <w:br/>
+        <w:t xml:space="preserve">       h.Descripcion, h.ESTADO_ID, e.TIPO_DE_CLASE AS Estado</w:t>
+        <w:br/>
+        <w:t>FROM Habitacion h</w:t>
+        <w:br/>
+        <w:t>JOIN TipoHabitacion   t ON h.TIPOHABITACIONID = t.ID</w:t>
+        <w:br/>
+        <w:t>JOIN Cama             c ON t.TIPOCAMAID       = c.ID</w:t>
+        <w:br/>
+        <w:t>JOIN EstadoHabitacion e ON h.ESTADO_ID        = e.ID</w:t>
+        <w:br/>
+        <w:t>WHERE h.HotelID = ?  ORDER BY h.ID</w:t>
+        <w:br/>
+        <w:br/>
+        <w:t>-- Crear habitación</w:t>
+        <w:br/>
+        <w:t>INSERT INTO Habitacion (HotelID, TIPOHABITACIONID, NUMEROHABITACION,</w:t>
+        <w:br/>
+        <w:t xml:space="preserve">                        Descripcion, ESTADO_ID)</w:t>
+        <w:br/>
+        <w:t>VALUES (?, ?, ?, ?, ?)</w:t>
+        <w:br/>
+        <w:br/>
+        <w:t>-- Agregar amenidad a hotel (verificar antes que no exista)</w:t>
+        <w:br/>
+        <w:t>SELECT COUNT(*) FROM HotelAmenidad WHERE HotelID=? AND AmenidadID=?</w:t>
+        <w:br/>
+        <w:t>INSERT INTO HotelAmenidad (HotelID, AmenidadID, Descripcion) VALUES (?, ?, ?)</w:t>
+        <w:br/>
+        <w:br/>
+        <w:t>-- Agregar imagen (BLOB)</w:t>
+        <w:br/>
+        <w:t>INSERT INTO ImagenHotel (HotelID, Imagen) VALUES (?, ?)</w:t>
+        <w:br/>
+        <w:br/>
+        <w:t>-- Obtener imagen (BLOB)</w:t>
+        <w:br/>
+        <w:t>SELECT ID FROM ImagenHotel WHERE HotelID=? ORDER BY ID</w:t>
+      </w:r>
+    </w:p>
+    <w:p>
+      <w:pPr>
+        <w:spacing w:before="200" w:after="80"/>
+      </w:pPr>
+      <w:r>
+        <w:rPr>
+          <w:rFonts w:ascii="Calibri" w:hAnsi="Calibri"/>
+          <w:b/>
+          <w:color w:val="2E75B6"/>
+          <w:sz w:val="26"/>
+        </w:rPr>
+        <w:t>5.9 Agencias — CRUD y Tokens</w:t>
+      </w:r>
+    </w:p>
+    <w:p>
+      <w:pPr>
+        <w:shd w:val="clear" w:color="auto" w:fill="F2F2F2"/>
+        <w:spacing w:before="60" w:after="60"/>
+        <w:ind w:left="288" w:right="288"/>
+      </w:pPr>
+      <w:r>
+        <w:rPr>
+          <w:rFonts w:ascii="Consolas" w:hAnsi="Consolas"/>
+          <w:sz w:val="18"/>
+        </w:rPr>
+        <w:t>-- AgenciaRepository.java</w:t>
+        <w:br/>
+        <w:br/>
+        <w:t>-- Listar agencias de un usuario webservice</w:t>
+        <w:br/>
+        <w:t>SELECT a.ID, a.Nombre, a.Correo, a.UsuarioWebis_ID, a.PorcentajeDescuento,</w:t>
+        <w:br/>
+        <w:t xml:space="preserve">       a.EstadoID, e.Estado, a.URL_Agencia</w:t>
+        <w:br/>
+        <w:t>FROM Agencia a JOIN EstadoAgencia e ON a.EstadoID=e.ID</w:t>
+        <w:br/>
+        <w:t>WHERE a.UsuarioWebis_ID = ?  ORDER BY a.ID</w:t>
+        <w:br/>
+        <w:br/>
+        <w:t>-- Verificar que usuario no tenga ya agencia ni aerolinea</w:t>
+        <w:br/>
+        <w:t>SELECT COUNT(*) AS C FROM Agencia WHERE UsuarioWebis_ID=?</w:t>
+        <w:br/>
+        <w:t>SELECT COUNT(*) AS C FROM AerolineaAliado WHERE UsuarioWebis=?</w:t>
+        <w:br/>
+        <w:br/>
+        <w:t>-- Crear agencia (webservice)</w:t>
+        <w:br/>
+        <w:t>INSERT INTO Agencia (Nombre, Correo, UsuarioWebis_ID, PorcentajeDescuento,</w:t>
+        <w:br/>
+        <w:t xml:space="preserve">                     EstadoID, URL_Agencia)</w:t>
+        <w:br/>
+        <w:t>VALUES (?, ?, ?, 0, 1, ?)</w:t>
+        <w:br/>
+        <w:br/>
+        <w:t>-- Guardar tokens del handshake</w:t>
+        <w:br/>
+        <w:t>UPDATE Agencia SET Token_HASH_Entrada=?, Token_HASH_Salida=? WHERE ID=?</w:t>
+        <w:br/>
+        <w:br/>
+        <w:t>-- Obtener agencia por token (AgenciaAuthMiddleware)</w:t>
+        <w:br/>
+        <w:t>SELECT ID, Nombre, URL_Agencia FROM Agencia WHERE Token_HASH_Entrada=?</w:t>
+        <w:br/>
+        <w:br/>
+        <w:t>-- Obtener ID de agencia por URL (HandshakeService)</w:t>
+        <w:br/>
+        <w:t>SELECT ID FROM Agencia WHERE URL_Agencia=?</w:t>
+        <w:br/>
+        <w:br/>
+        <w:t>-- Cambiar estado</w:t>
+        <w:br/>
+        <w:t>UPDATE Agencia SET EstadoID=? WHERE ID=?</w:t>
+        <w:br/>
+        <w:br/>
+        <w:t>-- Actualizar agencia (admin)</w:t>
+        <w:br/>
+        <w:t>UPDATE Agencia SET Nombre=?, Correo=?, URL_Agencia=?,</w:t>
+        <w:br/>
+        <w:t xml:space="preserve">                   PorcentajeDescuento=?, EstadoID=? WHERE ID=?</w:t>
+      </w:r>
+    </w:p>
+    <w:p>
+      <w:pPr>
+        <w:spacing w:before="200" w:after="80"/>
+      </w:pPr>
+      <w:r>
+        <w:rPr>
+          <w:rFonts w:ascii="Calibri" w:hAnsi="Calibri"/>
+          <w:b/>
+          <w:color w:val="2E75B6"/>
+          <w:sz w:val="26"/>
+        </w:rPr>
+        <w:t>5.10 Métricas del Sistema (Admin)</w:t>
+      </w:r>
+    </w:p>
+    <w:p>
+      <w:pPr>
+        <w:shd w:val="clear" w:color="auto" w:fill="F2F2F2"/>
+        <w:spacing w:before="60" w:after="60"/>
+        <w:ind w:left="288" w:right="288"/>
+      </w:pPr>
+      <w:r>
+        <w:rPr>
+          <w:rFonts w:ascii="Consolas" w:hAnsi="Consolas"/>
+          <w:sz w:val="18"/>
+        </w:rPr>
+        <w:t>-- HotelRepository.java — obtenerMetricas()</w:t>
+        <w:br/>
+        <w:t>-- Endpoint: GET /admin/reportes</w:t>
+        <w:br/>
+        <w:br/>
+        <w:t>SELECT COUNT(*) AS total FROM Usuario</w:t>
+        <w:br/>
+        <w:br/>
+        <w:t>SELECT COUNT(*) AS total FROM Hotel h</w:t>
+        <w:br/>
+        <w:t>JOIN Estado e ON h.EstadoID = e.ID</w:t>
+        <w:br/>
+        <w:t>WHERE LOWER(e.Estado) = 'activo'</w:t>
+        <w:br/>
+        <w:br/>
+        <w:t>SELECT COUNT(*) AS total FROM Reservacion r</w:t>
+        <w:br/>
+        <w:t>JOIN EstadoReserva er ON r.EstadoID = er.ID</w:t>
+        <w:br/>
+        <w:t>WHERE LOWER(TRIM(er.Estado)) = 'confirmada'</w:t>
+        <w:br/>
+        <w:br/>
+        <w:t>SELECT COUNT(*) AS total FROM Reservacion</w:t>
+        <w:br/>
+        <w:br/>
+        <w:t>SELECT NVL(SUM(r.Total), 0) AS total FROM Reservacion r</w:t>
+        <w:br/>
+        <w:t>JOIN EstadoReserva er ON r.EstadoID = er.ID</w:t>
+        <w:br/>
+        <w:t>WHERE LOWER(TRIM(er.Estado)) = 'confirmada'</w:t>
+        <w:br/>
+        <w:br/>
+        <w:t>SELECT LOWER(TRIM(er.Estado)) AS estado, COUNT(*) AS total</w:t>
+        <w:br/>
+        <w:t>FROM Reservacion r JOIN EstadoReserva er ON r.EstadoID = er.ID</w:t>
+        <w:br/>
+        <w:t>GROUP BY LOWER(TRIM(er.Estado))</w:t>
+        <w:br/>
+        <w:br/>
+        <w:t>-- Listar todas las reservaciones (admin)</w:t>
+        <w:br/>
+        <w:t>SELECT r.ID, r.No_Reservacion, r.Total, r.Fecha_Creacion, r.Fecha_Expiracion,</w:t>
+        <w:br/>
+        <w:t xml:space="preserve">       er.Estado, u.Nombre AS UsuarioNombre, u.Apellido AS UsuarioApellido,</w:t>
+        <w:br/>
+        <w:t xml:space="preserve">       u.Username, hot.Nombre AS HotelNombre,</w:t>
+        <w:br/>
+        <w:t xml:space="preserve">       MIN(dr.FechaCheckIn) AS CheckIn, MAX(dr.FechaCheckOut) AS CheckOut</w:t>
+        <w:br/>
+        <w:t>FROM Reservacion r</w:t>
+        <w:br/>
+        <w:t>JOIN EstadoReserva er ON r.EstadoID    = er.ID</w:t>
+        <w:br/>
+        <w:t>JOIN Usuario       u  ON r.Usuario_ID  = u.ID</w:t>
+        <w:br/>
+        <w:t>JOIN DetallesReservacion dr ON dr.ReservacionID = r.ID</w:t>
+        <w:br/>
+        <w:t>JOIN Habitacion    h  ON dr.HabitacionID = h.ID</w:t>
+        <w:br/>
+        <w:t>JOIN Hotel        hot ON h.HotelID     = hot.ID</w:t>
+        <w:br/>
+        <w:t>GROUP BY r.ID, r.No_Reservacion, r.Total, r.Fecha_Creacion, r.Fecha_Expiracion,</w:t>
+        <w:br/>
+        <w:t xml:space="preserve">         er.Estado, u.Nombre, u.Apellido, u.Username, hot.Nombre</w:t>
+        <w:br/>
+        <w:t>ORDER BY r.Fecha_Creacion DESC</w:t>
+      </w:r>
+    </w:p>
+    <w:p>
+      <w:pPr>
+        <w:spacing w:before="200" w:after="80"/>
+      </w:pPr>
+      <w:r>
+        <w:rPr>
+          <w:rFonts w:ascii="Calibri" w:hAnsi="Calibri"/>
+          <w:b/>
+          <w:color w:val="2E75B6"/>
+          <w:sz w:val="26"/>
+        </w:rPr>
+        <w:t>5.11 Esquema SQL (Miku_Inn.sql — tablas base)</w:t>
+      </w:r>
+    </w:p>
+    <w:p>
+      <w:r>
+        <w:rPr>
+          <w:rFonts w:ascii="Calibri" w:hAnsi="Calibri"/>
+          <w:sz w:val="22"/>
+        </w:rPr>
+        <w:t>El archivo Miku_Inn.sql contiene DDL de tablas base del sistema. Las tablas de dominio principales se infieren del código de repositorios.</w:t>
+      </w:r>
+    </w:p>
+    <w:p>
+      <w:pPr>
+        <w:shd w:val="clear" w:color="auto" w:fill="F2F2F2"/>
+        <w:spacing w:before="60" w:after="60"/>
+        <w:ind w:left="288" w:right="288"/>
+      </w:pPr>
+      <w:r>
+        <w:rPr>
+          <w:rFonts w:ascii="Consolas" w:hAnsi="Consolas"/>
+          <w:sz w:val="18"/>
+        </w:rPr>
+        <w:t>-- Tablas presentes en Miku_Inn.sql:</w:t>
+        <w:br/>
+        <w:t>CREATE TABLE PAIS (</w:t>
+        <w:br/>
+        <w:t xml:space="preserve">  ID     NUMBER PRIMARY KEY,</w:t>
+        <w:br/>
+        <w:t xml:space="preserve">  Nombre VARCHAR2(100)</w:t>
+        <w:br/>
+        <w:t>);</w:t>
+        <w:br/>
+        <w:br/>
+        <w:t>CREATE TABLE CIUDAD (</w:t>
+        <w:br/>
+        <w:t xml:space="preserve">  ID     NUMBER PRIMARY KEY,</w:t>
+        <w:br/>
+        <w:t xml:space="preserve">  Nombre VARCHAR2(100),</w:t>
+        <w:br/>
+        <w:t xml:space="preserve">  Pais_ID NUMBER REFERENCES Pais(ID)</w:t>
+        <w:br/>
+        <w:t>);</w:t>
+        <w:br/>
+        <w:br/>
+        <w:t>CREATE TABLE ROL (</w:t>
+        <w:br/>
+        <w:t xml:space="preserve">  ID       NUMBER PRIMARY KEY,</w:t>
+        <w:br/>
+        <w:t xml:space="preserve">  RolNombre VARCHAR2(50)  -- 1=Cliente, 2=Admin, 3=Webservice</w:t>
+        <w:br/>
+        <w:t>);</w:t>
+        <w:br/>
+        <w:br/>
+        <w:t>CREATE TABLE USUARIO (</w:t>
+        <w:br/>
+        <w:t xml:space="preserve">  ID               NUMBER PRIMARY KEY,</w:t>
+        <w:br/>
+        <w:t xml:space="preserve">  Correo           VARCHAR2(100) UNIQUE,</w:t>
+        <w:br/>
+        <w:t xml:space="preserve">  Contrasena       VARCHAR2(255),        -- BCrypt hash</w:t>
+        <w:br/>
+        <w:t xml:space="preserve">  Pasaporte        VARCHAR2(50) UNIQUE,</w:t>
+        <w:br/>
+        <w:t xml:space="preserve">  Username         VARCHAR2(100) UNIQUE,</w:t>
+        <w:br/>
+        <w:t xml:space="preserve">  Nombre           VARCHAR2(100),</w:t>
+        <w:br/>
+        <w:t xml:space="preserve">  Apellido         VARCHAR2(100),</w:t>
+        <w:br/>
+        <w:t xml:space="preserve">  Rol_ID           NUMBER REFERENCES Rol(ID),</w:t>
+        <w:br/>
+        <w:t xml:space="preserve">  Telefono         VARCHAR2(20),</w:t>
+        <w:br/>
+        <w:t xml:space="preserve">  Fecha_Nacimiento DATE,</w:t>
+        <w:br/>
+        <w:t xml:space="preserve">  Ciudad_ID        NUMBER REFERENCES Ciudad(ID)</w:t>
+        <w:br/>
+        <w:t>);</w:t>
+        <w:br/>
+        <w:br/>
+        <w:t>CREATE TABLE NACIONALIDAD (</w:t>
+        <w:br/>
+        <w:t xml:space="preserve">  ID     NUMBER PRIMARY KEY,</w:t>
+        <w:br/>
+        <w:t xml:space="preserve">  Nombre VARCHAR2(100)</w:t>
+        <w:br/>
+        <w:t>);</w:t>
+        <w:br/>
+        <w:br/>
+        <w:t>-- Tablas de negocio (inferidas del código):</w:t>
+        <w:br/>
+        <w:t>CREATE TABLE Estado (</w:t>
+        <w:br/>
+        <w:t xml:space="preserve">  ID     NUMBER PRIMARY KEY,</w:t>
+        <w:br/>
+        <w:t xml:space="preserve">  Estado VARCHAR2(50)  -- 'activo', 'inactivo'</w:t>
+        <w:br/>
+        <w:t>);</w:t>
+        <w:br/>
+        <w:br/>
+        <w:t>CREATE TABLE EstadoReserva (</w:t>
+        <w:br/>
+        <w:t xml:space="preserve">  ID     NUMBER PRIMARY KEY,</w:t>
+        <w:br/>
+        <w:t xml:space="preserve">  Estado VARCHAR2(50)  -- 'pendiente', 'confirmada', 'cancelada', 'expirada'</w:t>
+        <w:br/>
+        <w:t>);</w:t>
+        <w:br/>
+        <w:br/>
+        <w:t>CREATE TABLE EstadoAgencia (</w:t>
+        <w:br/>
+        <w:t xml:space="preserve">  ID     NUMBER PRIMARY KEY,</w:t>
+        <w:br/>
+        <w:t xml:space="preserve">  Estado VARCHAR2(50)  -- 'Activa', 'Inactiva'</w:t>
+        <w:br/>
+        <w:t>);</w:t>
+        <w:br/>
+        <w:br/>
+        <w:t>CREATE TABLE EstadoHabitacion (</w:t>
+        <w:br/>
+        <w:t xml:space="preserve">  ID             NUMBER PRIMARY KEY,</w:t>
+        <w:br/>
+        <w:t xml:space="preserve">  TIPO_DE_CLASE  VARCHAR2(50)  -- 'activa', 'inactiva'</w:t>
+        <w:br/>
+        <w:t>);</w:t>
+        <w:br/>
+        <w:br/>
+        <w:t>CREATE TABLE Cama (</w:t>
+        <w:br/>
+        <w:t xml:space="preserve">  ID             NUMBER PRIMARY KEY,</w:t>
+        <w:br/>
+        <w:t xml:space="preserve">  TIPO_DE_CLASE  VARCHAR2(50)  -- 'individual', 'doble', 'queen', 'king'</w:t>
+        <w:br/>
+        <w:t>);</w:t>
+        <w:br/>
+        <w:br/>
+        <w:t>CREATE TABLE Hotel (</w:t>
+        <w:br/>
+        <w:t xml:space="preserve">  ID          NUMBER PRIMARY KEY,</w:t>
+        <w:br/>
+        <w:t xml:space="preserve">  Nombre      VARCHAR2(255) NOT NULL,</w:t>
+        <w:br/>
+        <w:t xml:space="preserve">  Direccion   VARCHAR2(255),</w:t>
+        <w:br/>
+        <w:t xml:space="preserve">  Descripcion CLOB,</w:t>
+        <w:br/>
+        <w:t xml:space="preserve">  Rating      FLOAT,</w:t>
+        <w:br/>
+        <w:t xml:space="preserve">  EstadoID    NUMBER REFERENCES Estado(ID),</w:t>
+        <w:br/>
+        <w:t xml:space="preserve">  CiudadID    NUMBER REFERENCES Ciudad(ID)</w:t>
+        <w:br/>
+        <w:t>);</w:t>
+        <w:br/>
+        <w:br/>
+        <w:t>CREATE TABLE Amenidad (</w:t>
+        <w:br/>
+        <w:t xml:space="preserve">  ID     NUMBER PRIMARY KEY,</w:t>
+        <w:br/>
+        <w:t xml:space="preserve">  Nombre VARCHAR2(100) NOT NULL</w:t>
+        <w:br/>
+        <w:t>);</w:t>
+        <w:br/>
+        <w:br/>
+        <w:t>CREATE TABLE HotelAmenidad (</w:t>
+        <w:br/>
+        <w:t xml:space="preserve">  ID          NUMBER PRIMARY KEY,</w:t>
+        <w:br/>
+        <w:t xml:space="preserve">  HotelID     NUMBER REFERENCES Hotel(ID),</w:t>
+        <w:br/>
+        <w:t xml:space="preserve">  AmenidadID  NUMBER REFERENCES Amenidad(ID),</w:t>
+        <w:br/>
+        <w:t xml:space="preserve">  Descripcion VARCHAR2(255)</w:t>
+        <w:br/>
+        <w:t>);</w:t>
+        <w:br/>
+        <w:br/>
+        <w:t>CREATE TABLE TipoHabitacion (</w:t>
+        <w:br/>
+        <w:t xml:space="preserve">  ID               NUMBER PRIMARY KEY,</w:t>
+        <w:br/>
+        <w:t xml:space="preserve">  NOMBRE           VARCHAR2(100),</w:t>
+        <w:br/>
+        <w:t xml:space="preserve">  TIPOCAMAID       NUMBER REFERENCES Cama(ID),</w:t>
+        <w:br/>
+        <w:t xml:space="preserve">  PRECIOPERSONA    FLOAT,</w:t>
+        <w:br/>
+        <w:t xml:space="preserve">  PRECIONOCHE      FLOAT,</w:t>
+        <w:br/>
+        <w:t xml:space="preserve">  CAPACIDADMAXIMA  NUMBER,</w:t>
+        <w:br/>
+        <w:t xml:space="preserve">  METROSCUADRADOS  FLOAT</w:t>
+        <w:br/>
+        <w:t>);</w:t>
+        <w:br/>
+        <w:br/>
+        <w:t>CREATE TABLE Habitacion (</w:t>
+        <w:br/>
+        <w:t xml:space="preserve">  ID                NUMBER PRIMARY KEY,</w:t>
+        <w:br/>
+        <w:t xml:space="preserve">  HotelID           NUMBER REFERENCES Hotel(ID),</w:t>
+        <w:br/>
+        <w:t xml:space="preserve">  TIPOHABITACIONID  NUMBER REFERENCES TipoHabitacion(ID),</w:t>
+        <w:br/>
+        <w:t xml:space="preserve">  NUMEROHABITACION  VARCHAR2(10),</w:t>
+        <w:br/>
+        <w:t xml:space="preserve">  Descripcion       VARCHAR2(255),</w:t>
+        <w:br/>
+        <w:t xml:space="preserve">  ESTADO_ID         NUMBER REFERENCES EstadoHabitacion(ID)</w:t>
+        <w:br/>
+        <w:t>);</w:t>
+        <w:br/>
+        <w:br/>
+        <w:t>CREATE TABLE ImagenHotel (</w:t>
+        <w:br/>
+        <w:t xml:space="preserve">  ID      NUMBER PRIMARY KEY,</w:t>
+        <w:br/>
+        <w:t xml:space="preserve">  HotelID NUMBER REFERENCES Hotel(ID),</w:t>
+        <w:br/>
+        <w:t xml:space="preserve">  Imagen  BLOB</w:t>
+        <w:br/>
+        <w:t>);</w:t>
+        <w:br/>
+        <w:br/>
+        <w:t>CREATE TABLE ImagenHabitacion (</w:t>
+        <w:br/>
+        <w:t xml:space="preserve">  ID           NUMBER PRIMARY KEY,</w:t>
+        <w:br/>
+        <w:t xml:space="preserve">  HabitacionID NUMBER REFERENCES Habitacion(ID),</w:t>
+        <w:br/>
+        <w:t xml:space="preserve">  Imagen       BLOB</w:t>
+        <w:br/>
+        <w:t>);</w:t>
+        <w:br/>
+        <w:br/>
+        <w:t>CREATE TABLE ImagenHotelAmenidad (</w:t>
+        <w:br/>
+        <w:t xml:space="preserve">  ID              NUMBER PRIMARY KEY,</w:t>
+        <w:br/>
+        <w:t xml:space="preserve">  HotelAmenidadID NUMBER REFERENCES HotelAmenidad(ID),</w:t>
+        <w:br/>
+        <w:t xml:space="preserve">  Imagen          BLOB</w:t>
+        <w:br/>
+        <w:t>);</w:t>
+        <w:br/>
+        <w:br/>
+        <w:t>CREATE TABLE Agencia (</w:t>
+        <w:br/>
+        <w:t xml:space="preserve">  ID                  NUMBER PRIMARY KEY,</w:t>
+        <w:br/>
+        <w:t xml:space="preserve">  Nombre              VARCHAR2(255) NOT NULL,</w:t>
+        <w:br/>
+        <w:t xml:space="preserve">  Correo              VARCHAR2(100),</w:t>
+        <w:br/>
+        <w:t xml:space="preserve">  UsuarioWebis_ID     NUMBER REFERENCES Usuario(ID),</w:t>
+        <w:br/>
+        <w:t xml:space="preserve">  PorcentajeDescuento FLOAT,</w:t>
+        <w:br/>
+        <w:t xml:space="preserve">  EstadoID            NUMBER REFERENCES EstadoAgencia(ID),</w:t>
+        <w:br/>
+        <w:t xml:space="preserve">  URL_Agencia         VARCHAR2(255) UNIQUE,</w:t>
+        <w:br/>
+        <w:t xml:space="preserve">  Token_HASH_Entrada  VARCHAR2(255),</w:t>
+        <w:br/>
+        <w:t xml:space="preserve">  Token_HASH_Salida   VARCHAR2(255)</w:t>
+        <w:br/>
+        <w:t>);</w:t>
+        <w:br/>
+        <w:br/>
+        <w:t>CREATE TABLE Reservacion (</w:t>
+        <w:br/>
+        <w:t xml:space="preserve">  ID                 NUMBER PRIMARY KEY,</w:t>
+        <w:br/>
+        <w:t xml:space="preserve">  No_Reservacion     VARCHAR2(50) UNIQUE NOT NULL,</w:t>
+        <w:br/>
+        <w:t xml:space="preserve">  Total              FLOAT,</w:t>
+        <w:br/>
+        <w:t xml:space="preserve">  EstadoID           NUMBER REFERENCES EstadoReserva(ID),</w:t>
+        <w:br/>
+        <w:t xml:space="preserve">  Usuario_ID         NUMBER REFERENCES Usuario(ID),</w:t>
+        <w:br/>
+        <w:t xml:space="preserve">  Fecha_Creacion     TIMESTAMP,</w:t>
+        <w:br/>
+        <w:t xml:space="preserve">  Fecha_Expiracion   TIMESTAMP,</w:t>
+        <w:br/>
+        <w:t xml:space="preserve">  Fecha_Cancelacion  DATE,</w:t>
+        <w:br/>
+        <w:t xml:space="preserve">  Motivo_Cancelacion VARCHAR2(255)</w:t>
+        <w:br/>
+        <w:t>);</w:t>
+        <w:br/>
+        <w:br/>
+        <w:t>CREATE TABLE DetallesReservacion (</w:t>
+        <w:br/>
+        <w:t xml:space="preserve">  ID               NUMBER PRIMARY KEY,</w:t>
+        <w:br/>
+        <w:t xml:space="preserve">  ReservacionID    NUMBER REFERENCES Reservacion(ID),</w:t>
+        <w:br/>
+        <w:t xml:space="preserve">  HabitacionID     NUMBER REFERENCES Habitacion(ID),</w:t>
+        <w:br/>
+        <w:t xml:space="preserve">  FechaCheckIn     DATE,</w:t>
+        <w:br/>
+        <w:t xml:space="preserve">  FechaCheckOut    DATE,</w:t>
+        <w:br/>
+        <w:t xml:space="preserve">  CantidadPersonas NUMBER,</w:t>
+        <w:br/>
+        <w:t xml:space="preserve">  Total            FLOAT</w:t>
+        <w:br/>
+        <w:t>);</w:t>
+        <w:br/>
+        <w:br/>
+        <w:t>CREATE TABLE Busqueda (</w:t>
+        <w:br/>
+        <w:t xml:space="preserve">  ID               NUMBER PRIMARY KEY,</w:t>
+        <w:br/>
+        <w:t xml:space="preserve">  CiudadID         NUMBER REFERENCES Ciudad(ID),</w:t>
+        <w:br/>
+        <w:t xml:space="preserve">  FechaCheckIn     DATE,</w:t>
+        <w:br/>
+        <w:t xml:space="preserve">  FechaCheckOut    DATE,</w:t>
+        <w:br/>
+        <w:t xml:space="preserve">  CantidadPersonas NUMBER,</w:t>
+        <w:br/>
+        <w:t xml:space="preserve">  UsuarioID        NUMBER REFERENCES Usuario(ID),</w:t>
+        <w:br/>
+        <w:t xml:space="preserve">  AgenciaID        NUMBER REFERENCES Agencia(ID),</w:t>
+        <w:br/>
+        <w:t xml:space="preserve">  TipoBusquedaID   NUMBER,</w:t>
+        <w:br/>
+        <w:t xml:space="preserve">  Fecha            TIMESTAMP</w:t>
+        <w:br/>
+        <w:t>);</w:t>
+        <w:br/>
+        <w:br/>
+        <w:t>CREATE TABLE Comentario (</w:t>
+        <w:br/>
+        <w:t xml:space="preserve">  ID           NUMBER PRIMARY KEY,</w:t>
+        <w:br/>
+        <w:t xml:space="preserve">  HotelID      NUMBER REFERENCES Hotel(ID),</w:t>
+        <w:br/>
+        <w:t xml:space="preserve">  Usuario_ID   NUMBER REFERENCES Usuario(ID),</w:t>
+        <w:br/>
+        <w:t xml:space="preserve">  Calificacion NUMBER,</w:t>
+        <w:br/>
+        <w:t xml:space="preserve">  Descripcion  CLOB,</w:t>
+        <w:br/>
+        <w:t xml:space="preserve">  Fecha        TIMESTAMP</w:t>
+        <w:br/>
+        <w:t>);</w:t>
+        <w:br/>
+        <w:br/>
+        <w:t>CREATE TABLE UsuarioNacionalidad (</w:t>
+        <w:br/>
+        <w:t xml:space="preserve">  Usuario_ID      NUMBER REFERENCES Usuario(ID),</w:t>
+        <w:br/>
+        <w:t xml:space="preserve">  Nacionalidad_ID NUMBER REFERENCES Nacionalidad(ID),</w:t>
+        <w:br/>
+        <w:t xml:space="preserve">  PRIMARY KEY (Usuario_ID, Nacionalidad_ID)</w:t>
+        <w:br/>
+        <w:t>);</w:t>
+        <w:br/>
+        <w:br/>
+        <w:t>CREATE TABLE AerolineaAliado (</w:t>
+        <w:br/>
+        <w:t xml:space="preserve">  ID                 NUMBER PRIMARY KEY,</w:t>
+        <w:br/>
+        <w:t xml:space="preserve">  Nombre             VARCHAR2(255),</w:t>
+        <w:br/>
+        <w:t xml:space="preserve">  URL_Aerolinea      VARCHAR2(255),</w:t>
+        <w:br/>
+        <w:t xml:space="preserve">  UsuarioWebis       NUMBER REFERENCES Usuario(ID),</w:t>
+        <w:br/>
+        <w:t xml:space="preserve">  Token_HASH_Entrada VARCHAR2(255),</w:t>
+        <w:br/>
+        <w:t xml:space="preserve">  Token_HASH_Salida  VARCHAR2(255)</w:t>
+        <w:br/>
+        <w:t>);</w:t>
+        <w:br/>
+        <w:br/>
+        <w:t>CREATE TABLE TokenValidacion (</w:t>
+        <w:br/>
+        <w:t xml:space="preserve">  ID                  NUMBER PRIMARY KEY,</w:t>
+        <w:br/>
+        <w:t xml:space="preserve">  Token               VARCHAR2(255) UNIQUE,</w:t>
+        <w:br/>
+        <w:t xml:space="preserve">  Ciudad              VARCHAR2(100),</w:t>
+        <w:br/>
+        <w:t xml:space="preserve">  PorcentajeDescuento NUMBER,</w:t>
+        <w:br/>
+        <w:t xml:space="preserve">  FechaCreacion       TIMESTAMP,</w:t>
+        <w:br/>
+        <w:t xml:space="preserve">  FechaExpiracion     TIMESTAMP</w:t>
+        <w:br/>
+        <w:t>);</w:t>
+      </w:r>
+    </w:p>
+    <w:p>
+      <w:r>
+        <w:br w:type="page"/>
+      </w:r>
+    </w:p>
+    <w:p>
+      <w:pPr>
+        <w:spacing w:before="280" w:after="120"/>
+      </w:pPr>
+      <w:r>
+        <w:rPr>
+          <w:rFonts w:ascii="Calibri" w:hAnsi="Calibri"/>
+          <w:b/>
+          <w:color w:val="1F3864"/>
+          <w:sz w:val="32"/>
+        </w:rPr>
+        <w:t>Anexo — Queries SQL de Métricas para Defensa Oral</w:t>
+      </w:r>
+    </w:p>
+    <w:p>
+      <w:r>
+        <w:rPr>
+          <w:rFonts w:ascii="Calibri" w:hAnsi="Calibri"/>
+          <w:sz w:val="22"/>
+        </w:rPr>
+        <w:t>Todos los queries siguientes son para Oracle Database. Ejecutar desde SQL*Plus, SQL Developer o similar.</w:t>
+      </w:r>
+    </w:p>
+    <w:p>
+      <w:pPr>
+        <w:spacing w:before="120" w:after="40"/>
+      </w:pPr>
+      <w:r>
+        <w:rPr>
+          <w:rFonts w:ascii="Calibri" w:hAnsi="Calibri"/>
+          <w:b/>
+          <w:sz w:val="22"/>
+        </w:rPr>
+        <w:t>A.1 Total de usuarios registrados</w:t>
+      </w:r>
+    </w:p>
+    <w:p>
+      <w:pPr>
+        <w:shd w:val="clear" w:color="auto" w:fill="F2F2F2"/>
+        <w:spacing w:before="60" w:after="60"/>
+        <w:ind w:left="288" w:right="288"/>
+      </w:pPr>
+      <w:r>
+        <w:rPr>
+          <w:rFonts w:ascii="Consolas" w:hAnsi="Consolas"/>
+          <w:sz w:val="18"/>
+        </w:rPr>
+        <w:t>SELECT COUNT(*) AS TotalUsuarios FROM Usuario</w:t>
+      </w:r>
+    </w:p>
+    <w:p>
+      <w:pPr>
+        <w:spacing w:before="120" w:after="40"/>
+      </w:pPr>
+      <w:r>
+        <w:rPr>
+          <w:rFonts w:ascii="Calibri" w:hAnsi="Calibri"/>
+          <w:b/>
+          <w:sz w:val="22"/>
+        </w:rPr>
+        <w:t>A.2 Usuarios por rol</w:t>
+      </w:r>
+    </w:p>
+    <w:p>
+      <w:pPr>
+        <w:shd w:val="clear" w:color="auto" w:fill="F2F2F2"/>
+        <w:spacing w:before="60" w:after="60"/>
+        <w:ind w:left="288" w:right="288"/>
+      </w:pPr>
+      <w:r>
+        <w:rPr>
+          <w:rFonts w:ascii="Consolas" w:hAnsi="Consolas"/>
+          <w:sz w:val="18"/>
+        </w:rPr>
+        <w:t>SELECT r.RolNombre AS Rol, COUNT(u.ID) AS Total</w:t>
+        <w:br/>
+        <w:t>FROM Usuario u LEFT JOIN Rol r ON u.Rol_ID = r.ID</w:t>
+        <w:br/>
+        <w:t>GROUP BY r.RolNombre ORDER BY Total DESC</w:t>
+      </w:r>
+    </w:p>
+    <w:p>
+      <w:pPr>
+        <w:spacing w:before="120" w:after="40"/>
+      </w:pPr>
+      <w:r>
+        <w:rPr>
+          <w:rFonts w:ascii="Calibri" w:hAnsi="Calibri"/>
+          <w:b/>
+          <w:sz w:val="22"/>
+        </w:rPr>
+        <w:t>A.3 Total de reservaciones por estado</w:t>
+      </w:r>
+    </w:p>
+    <w:p>
+      <w:pPr>
+        <w:shd w:val="clear" w:color="auto" w:fill="F2F2F2"/>
+        <w:spacing w:before="60" w:after="60"/>
+        <w:ind w:left="288" w:right="288"/>
+      </w:pPr>
+      <w:r>
+        <w:rPr>
+          <w:rFonts w:ascii="Consolas" w:hAnsi="Consolas"/>
+          <w:sz w:val="18"/>
+        </w:rPr>
+        <w:t>SELECT er.Estado, COUNT(r.ID) AS Total</w:t>
+        <w:br/>
+        <w:t>FROM Reservacion r</w:t>
+        <w:br/>
+        <w:t>LEFT JOIN EstadoReserva er ON r.EstadoID = er.ID</w:t>
+        <w:br/>
+        <w:t>GROUP BY er.Estado ORDER BY Total DESC</w:t>
+      </w:r>
+    </w:p>
+    <w:p>
+      <w:pPr>
+        <w:spacing w:before="120" w:after="40"/>
+      </w:pPr>
+      <w:r>
+        <w:rPr>
+          <w:rFonts w:ascii="Calibri" w:hAnsi="Calibri"/>
+          <w:b/>
+          <w:sz w:val="22"/>
+        </w:rPr>
+        <w:t>A.4 Reservaciones por mes (últimos 12 meses)</w:t>
+      </w:r>
+    </w:p>
+    <w:p>
+      <w:pPr>
+        <w:shd w:val="clear" w:color="auto" w:fill="F2F2F2"/>
+        <w:spacing w:before="60" w:after="60"/>
+        <w:ind w:left="288" w:right="288"/>
+      </w:pPr>
+      <w:r>
+        <w:rPr>
+          <w:rFonts w:ascii="Consolas" w:hAnsi="Consolas"/>
+          <w:sz w:val="18"/>
+        </w:rPr>
+        <w:t>SELECT TO_CHAR(r.Fecha_Creacion,'YYYY-MM') AS Mes,</w:t>
+        <w:br/>
+        <w:t xml:space="preserve">       COUNT(*) AS Total, SUM(r.Total) AS Ingresos</w:t>
+        <w:br/>
+        <w:t>FROM Reservacion r</w:t>
+        <w:br/>
+        <w:t>WHERE r.Fecha_Creacion &gt;= ADD_MONTHS(SYSDATE,-12)</w:t>
+        <w:br/>
+        <w:t>GROUP BY TO_CHAR(r.Fecha_Creacion,'YYYY-MM')</w:t>
+        <w:br/>
+        <w:t>ORDER BY Mes</w:t>
+      </w:r>
+    </w:p>
+    <w:p>
+      <w:pPr>
+        <w:spacing w:before="120" w:after="40"/>
+      </w:pPr>
+      <w:r>
+        <w:rPr>
+          <w:rFonts w:ascii="Calibri" w:hAnsi="Calibri"/>
+          <w:b/>
+          <w:sz w:val="22"/>
+        </w:rPr>
+        <w:t>A.5 Ingresos totales (reservaciones confirmadas)</w:t>
+      </w:r>
+    </w:p>
+    <w:p>
+      <w:pPr>
+        <w:shd w:val="clear" w:color="auto" w:fill="F2F2F2"/>
+        <w:spacing w:before="60" w:after="60"/>
+        <w:ind w:left="288" w:right="288"/>
+      </w:pPr>
+      <w:r>
+        <w:rPr>
+          <w:rFonts w:ascii="Consolas" w:hAnsi="Consolas"/>
+          <w:sz w:val="18"/>
+        </w:rPr>
+        <w:t>SELECT NVL(SUM(r.Total),0) AS IngresosTotales</w:t>
+        <w:br/>
+        <w:t>FROM Reservacion r JOIN EstadoReserva er ON r.EstadoID=er.ID</w:t>
+        <w:br/>
+        <w:t>WHERE LOWER(TRIM(er.Estado))='confirmada'</w:t>
+      </w:r>
+    </w:p>
+    <w:p>
+      <w:pPr>
+        <w:spacing w:before="120" w:after="40"/>
+      </w:pPr>
+      <w:r>
+        <w:rPr>
+          <w:rFonts w:ascii="Calibri" w:hAnsi="Calibri"/>
+          <w:b/>
+          <w:sz w:val="22"/>
+        </w:rPr>
+        <w:t>A.6 Ingresos por mes</w:t>
+      </w:r>
+    </w:p>
+    <w:p>
+      <w:pPr>
+        <w:shd w:val="clear" w:color="auto" w:fill="F2F2F2"/>
+        <w:spacing w:before="60" w:after="60"/>
+        <w:ind w:left="288" w:right="288"/>
+      </w:pPr>
+      <w:r>
+        <w:rPr>
+          <w:rFonts w:ascii="Consolas" w:hAnsi="Consolas"/>
+          <w:sz w:val="18"/>
+        </w:rPr>
+        <w:t>SELECT TO_CHAR(r.Fecha_Creacion,'YYYY-MM') AS Mes, SUM(r.Total) AS Ingresos</w:t>
+        <w:br/>
+        <w:t>FROM Reservacion r JOIN EstadoReserva er ON r.EstadoID=er.ID</w:t>
+        <w:br/>
+        <w:t>WHERE LOWER(TRIM(er.Estado))='confirmada'</w:t>
+        <w:br/>
+        <w:t>GROUP BY TO_CHAR(r.Fecha_Creacion,'YYYY-MM')</w:t>
+        <w:br/>
+        <w:t>ORDER BY Mes</w:t>
+      </w:r>
+    </w:p>
+    <w:p>
+      <w:pPr>
+        <w:spacing w:before="120" w:after="40"/>
+      </w:pPr>
+      <w:r>
+        <w:rPr>
+          <w:rFonts w:ascii="Calibri" w:hAnsi="Calibri"/>
+          <w:b/>
+          <w:sz w:val="22"/>
+        </w:rPr>
+        <w:t>A.7 Top 10 hoteles más reservados</w:t>
+      </w:r>
+    </w:p>
+    <w:p>
+      <w:pPr>
+        <w:shd w:val="clear" w:color="auto" w:fill="F2F2F2"/>
+        <w:spacing w:before="60" w:after="60"/>
+        <w:ind w:left="288" w:right="288"/>
+      </w:pPr>
+      <w:r>
+        <w:rPr>
+          <w:rFonts w:ascii="Consolas" w:hAnsi="Consolas"/>
+          <w:sz w:val="18"/>
+        </w:rPr>
+        <w:t>SELECT hot.Nombre AS Hotel, COUNT(r.ID) AS TotalReservaciones,</w:t>
+        <w:br/>
+        <w:t xml:space="preserve">       SUM(r.Total) AS IngresoTotal</w:t>
+        <w:br/>
+        <w:t>FROM Reservacion r</w:t>
+        <w:br/>
+        <w:t>JOIN EstadoReserva er ON r.EstadoID=er.ID</w:t>
+        <w:br/>
+        <w:t>JOIN DetallesReservacion dr ON dr.ReservacionID=r.ID</w:t>
+        <w:br/>
+        <w:t>JOIN Habitacion h ON dr.HabitacionID=h.ID</w:t>
+        <w:br/>
+        <w:t>JOIN Hotel hot ON h.HotelID=hot.ID</w:t>
+        <w:br/>
+        <w:t>WHERE LOWER(TRIM(er.Estado)) IN ('confirmada','pendiente')</w:t>
+        <w:br/>
+        <w:t>GROUP BY hot.Nombre ORDER BY TotalReservaciones DESC</w:t>
+        <w:br/>
+        <w:t>FETCH FIRST 10 ROWS ONLY</w:t>
+      </w:r>
+    </w:p>
+    <w:p>
+      <w:pPr>
+        <w:spacing w:before="120" w:after="40"/>
+      </w:pPr>
+      <w:r>
+        <w:rPr>
+          <w:rFonts w:ascii="Calibri" w:hAnsi="Calibri"/>
+          <w:b/>
+          <w:sz w:val="22"/>
+        </w:rPr>
+        <w:t>A.8 Top 10 usuarios con más reservaciones</w:t>
+      </w:r>
+    </w:p>
+    <w:p>
+      <w:pPr>
+        <w:shd w:val="clear" w:color="auto" w:fill="F2F2F2"/>
+        <w:spacing w:before="60" w:after="60"/>
+        <w:ind w:left="288" w:right="288"/>
+      </w:pPr>
+      <w:r>
+        <w:rPr>
+          <w:rFonts w:ascii="Consolas" w:hAnsi="Consolas"/>
+          <w:sz w:val="18"/>
+        </w:rPr>
+        <w:t>SELECT u.Nombre||' '||u.Apellido AS Usuario, u.Correo, COUNT(r.ID) AS Total</w:t>
+        <w:br/>
+        <w:t>FROM Reservacion r JOIN Usuario u ON r.Usuario_ID=u.ID</w:t>
+        <w:br/>
+        <w:t>GROUP BY u.Nombre, u.Apellido, u.Correo</w:t>
+        <w:br/>
+        <w:t>ORDER BY Total DESC</w:t>
+        <w:br/>
+        <w:t>FETCH FIRST 10 ROWS ONLY</w:t>
+      </w:r>
+    </w:p>
+    <w:p>
+      <w:pPr>
+        <w:spacing w:before="120" w:after="40"/>
+      </w:pPr>
+      <w:r>
+        <w:rPr>
+          <w:rFonts w:ascii="Calibri" w:hAnsi="Calibri"/>
+          <w:b/>
+          <w:sz w:val="22"/>
+        </w:rPr>
+        <w:t>A.9 Tasa de cancelación</w:t>
+      </w:r>
+    </w:p>
+    <w:p>
+      <w:pPr>
+        <w:shd w:val="clear" w:color="auto" w:fill="F2F2F2"/>
+        <w:spacing w:before="60" w:after="60"/>
+        <w:ind w:left="288" w:right="288"/>
+      </w:pPr>
+      <w:r>
+        <w:rPr>
+          <w:rFonts w:ascii="Consolas" w:hAnsi="Consolas"/>
+          <w:sz w:val="18"/>
+        </w:rPr>
+        <w:t>SELECT</w:t>
+        <w:br/>
+        <w:t xml:space="preserve">  COUNT(CASE WHEN LOWER(TRIM(er.Estado))='cancelada' THEN 1 END) AS Canceladas,</w:t>
+        <w:br/>
+        <w:t xml:space="preserve">  COUNT(*) AS Total,</w:t>
+        <w:br/>
+        <w:t xml:space="preserve">  ROUND(100 * COUNT(CASE WHEN LOWER(TRIM(er.Estado))='cancelada' THEN 1 END)</w:t>
+        <w:br/>
+        <w:t xml:space="preserve">        / NULLIF(COUNT(*),0), 2) AS TasaCancelacion_Pct</w:t>
+        <w:br/>
+        <w:t>FROM Reservacion r JOIN EstadoReserva er ON r.EstadoID=er.ID</w:t>
+      </w:r>
+    </w:p>
+    <w:p>
+      <w:pPr>
+        <w:spacing w:before="120" w:after="40"/>
+      </w:pPr>
+      <w:r>
+        <w:rPr>
+          <w:rFonts w:ascii="Calibri" w:hAnsi="Calibri"/>
+          <w:b/>
+          <w:sz w:val="22"/>
+        </w:rPr>
+        <w:t>A.10 Habitaciones más reservadas</w:t>
+      </w:r>
+    </w:p>
+    <w:p>
+      <w:pPr>
+        <w:shd w:val="clear" w:color="auto" w:fill="F2F2F2"/>
+        <w:spacing w:before="60" w:after="60"/>
+        <w:ind w:left="288" w:right="288"/>
+      </w:pPr>
+      <w:r>
+        <w:rPr>
+          <w:rFonts w:ascii="Consolas" w:hAnsi="Consolas"/>
+          <w:sz w:val="18"/>
+        </w:rPr>
+        <w:t>SELECT hot.Nombre AS Hotel, t.NOMBRE AS TipoHabitacion,</w:t>
+        <w:br/>
+        <w:t xml:space="preserve">       h.NUMEROHABITACION, COUNT(dr.ID) AS VecesReservada</w:t>
+        <w:br/>
+        <w:t>FROM DetallesReservacion dr</w:t>
+        <w:br/>
+        <w:t>JOIN Habitacion h ON dr.HabitacionID=h.ID</w:t>
+        <w:br/>
+        <w:t>JOIN TipoHabitacion t ON h.TIPOHABITACIONID=t.ID</w:t>
+        <w:br/>
+        <w:t>JOIN Hotel hot ON h.HotelID=hot.ID</w:t>
+        <w:br/>
+        <w:t>GROUP BY hot.Nombre, t.NOMBRE, h.NUMEROHABITACION</w:t>
+        <w:br/>
+        <w:t>ORDER BY VecesReservada DESC</w:t>
+        <w:br/>
+        <w:t>FETCH FIRST 10 ROWS ONLY</w:t>
+      </w:r>
+    </w:p>
+    <w:p>
+      <w:pPr>
+        <w:spacing w:before="120" w:after="40"/>
+      </w:pPr>
+      <w:r>
+        <w:rPr>
+          <w:rFonts w:ascii="Calibri" w:hAnsi="Calibri"/>
+          <w:b/>
+          <w:sz w:val="22"/>
+        </w:rPr>
+        <w:t>A.11 Agencias más activas</w:t>
+      </w:r>
+    </w:p>
+    <w:p>
+      <w:pPr>
+        <w:shd w:val="clear" w:color="auto" w:fill="F2F2F2"/>
+        <w:spacing w:before="60" w:after="60"/>
+        <w:ind w:left="288" w:right="288"/>
+      </w:pPr>
+      <w:r>
+        <w:rPr>
+          <w:rFonts w:ascii="Consolas" w:hAnsi="Consolas"/>
+          <w:sz w:val="18"/>
+        </w:rPr>
+        <w:t>SELECT a.Nombre AS Agencia, a.URL_Agencia, COUNT(r.ID) AS Reservaciones</w:t>
+        <w:br/>
+        <w:t>FROM Agencia a</w:t>
+        <w:br/>
+        <w:t>JOIN Usuario u ON a.UsuarioWebis_ID=u.ID</w:t>
+        <w:br/>
+        <w:t>JOIN Reservacion r ON r.Usuario_ID=u.ID</w:t>
+        <w:br/>
+        <w:t>GROUP BY a.Nombre, a.URL_Agencia</w:t>
+        <w:br/>
+        <w:t>ORDER BY Reservaciones DESC</w:t>
+        <w:br/>
+        <w:t>FETCH FIRST 10 ROWS ONLY</w:t>
+      </w:r>
+    </w:p>
+    <w:p>
+      <w:pPr>
+        <w:spacing w:before="120" w:after="40"/>
+      </w:pPr>
+      <w:r>
+        <w:rPr>
+          <w:rFonts w:ascii="Calibri" w:hAnsi="Calibri"/>
+          <w:b/>
+          <w:sz w:val="22"/>
+        </w:rPr>
+        <w:t>A.12 Destinos más buscados</w:t>
+      </w:r>
+    </w:p>
+    <w:p>
+      <w:pPr>
+        <w:shd w:val="clear" w:color="auto" w:fill="F2F2F2"/>
+        <w:spacing w:before="60" w:after="60"/>
+        <w:ind w:left="288" w:right="288"/>
+      </w:pPr>
+      <w:r>
+        <w:rPr>
+          <w:rFonts w:ascii="Consolas" w:hAnsi="Consolas"/>
+          <w:sz w:val="18"/>
+        </w:rPr>
+        <w:t>SELECT c.Nombre AS Ciudad, p.Nombre AS Pais, COUNT(b.ID) AS Busquedas</w:t>
+        <w:br/>
+        <w:t>FROM Busqueda b JOIN Ciudad c ON b.CiudadID=c.ID JOIN Pais p ON c.Pais_ID=p.ID</w:t>
+        <w:br/>
+        <w:t>GROUP BY c.Nombre, p.Nombre ORDER BY Busquedas DESC</w:t>
+        <w:br/>
+        <w:t>FETCH FIRST 10 ROWS ONLY</w:t>
+      </w:r>
+    </w:p>
+    <w:p>
+      <w:pPr>
+        <w:spacing w:before="120" w:after="40"/>
+      </w:pPr>
+      <w:r>
+        <w:rPr>
+          <w:rFonts w:ascii="Calibri" w:hAnsi="Calibri"/>
+          <w:b/>
+          <w:sz w:val="22"/>
+        </w:rPr>
+        <w:t>A.13 Tiempo promedio entre creación y pago</w:t>
+      </w:r>
+    </w:p>
+    <w:p>
+      <w:pPr>
+        <w:shd w:val="clear" w:color="auto" w:fill="F2F2F2"/>
+        <w:spacing w:before="60" w:after="60"/>
+        <w:ind w:left="288" w:right="288"/>
+      </w:pPr>
+      <w:r>
+        <w:rPr>
+          <w:rFonts w:ascii="Consolas" w:hAnsi="Consolas"/>
+          <w:sz w:val="18"/>
+        </w:rPr>
+        <w:t>SELECT ROUND(AVG(</w:t>
+        <w:br/>
+        <w:t xml:space="preserve">  (r.Fecha_Expiracion - r.Fecha_Creacion) * 24 * 60</w:t>
+        <w:br/>
+        <w:t>), 2) AS PromMinutosHastaConfirmacion</w:t>
+        <w:br/>
+        <w:t>FROM Reservacion r JOIN EstadoReserva er ON r.EstadoID=er.ID</w:t>
+        <w:br/>
+        <w:t>WHERE LOWER(TRIM(er.Estado))='confirmada'</w:t>
+      </w:r>
+    </w:p>
+    <w:p>
+      <w:pPr>
+        <w:spacing w:before="120" w:after="40"/>
+      </w:pPr>
+      <w:r>
+        <w:rPr>
+          <w:rFonts w:ascii="Calibri" w:hAnsi="Calibri"/>
+          <w:b/>
+          <w:sz w:val="22"/>
+        </w:rPr>
+        <w:t>A.14 Hoteles con mejor calificación promedio</w:t>
+      </w:r>
+    </w:p>
+    <w:p>
+      <w:pPr>
+        <w:shd w:val="clear" w:color="auto" w:fill="F2F2F2"/>
+        <w:spacing w:before="60" w:after="60"/>
+        <w:ind w:left="288" w:right="288"/>
+      </w:pPr>
+      <w:r>
+        <w:rPr>
+          <w:rFonts w:ascii="Consolas" w:hAnsi="Consolas"/>
+          <w:sz w:val="18"/>
+        </w:rPr>
+        <w:t>SELECT hot.Nombre, ROUND(AVG(c.Calificacion),2) AS CalificacionPromedio,</w:t>
+        <w:br/>
+        <w:t xml:space="preserve">       COUNT(c.ID) AS TotalComentarios</w:t>
+        <w:br/>
+        <w:t>FROM Comentario c JOIN Hotel hot ON c.HotelID=hot.ID</w:t>
+        <w:br/>
+        <w:t>GROUP BY hot.Nombre HAVING COUNT(c.ID)&gt;=3</w:t>
+        <w:br/>
+        <w:t>ORDER BY CalificacionPromedio DESC</w:t>
+      </w:r>
+    </w:p>
+    <w:p>
+      <w:r>
+        <w:br w:type="page"/>
       </w:r>
     </w:p>
     <w:p>

</xml_diff>